<commit_message>
chore: sync tours — delete 8 outdated, update 5 with visa info
Remove removed tours from index, commit updated DOCX with visa fields.
Add _analysis.json to .gitignore.
</commit_message>
<xml_diff>
--- a/tours/Болгария_От_Дуная_до_Босфора_сокращено.docx
+++ b/tours/Болгария_От_Дуная_до_Босфора_сокращено.docx
@@ -105,6 +105,42 @@
       </w:r>
       <w:r>
         <w:t>Экскурсионный автобусный тур с отдыхом на море (All Inclusive на курорте)</w:t>
+      </w:r>
+    </w:p>
+    <w:p>
+      <w:pPr>
+        <w:widowControl w:val="1"/>
+        <w:spacing w:after="240"/>
+      </w:pPr>
+      <w:r>
+        <w:rPr>
+          <w:rFonts w:ascii="Google Sans Text" w:hAnsi="Google Sans Text" w:cs="Google Sans Text" w:eastAsia="Google Sans Text"/>
+          <w:lang/>
+        </w:rPr>
+        <w:t>Виза</w:t>
+      </w:r>
+      <w:r>
+        <w:rPr>
+          <w:rFonts w:ascii="Google Sans Text" w:hAnsi="Google Sans Text" w:cs="Google Sans Text" w:eastAsia="Google Sans Text"/>
+          <w:lang w:val="en-US" w:bidi="en-US" w:eastAsia="en-US"/>
+        </w:rPr>
+        <w:t xml:space="preserve">: </w:t>
+      </w:r>
+      <w:r>
+        <w:rPr>
+          <w:rFonts w:ascii="Google Sans Text" w:hAnsi="Google Sans Text" w:cs="Google Sans Text" w:eastAsia="Google Sans Text"/>
+          <w:rtl w:val="0"/>
+          <w:lang w:val="ru-BY" w:bidi="ru-BY" w:eastAsia="ru-BY"/>
+        </w:rPr>
+        <w:t xml:space="preserve">НЕ </w:t>
+      </w:r>
+      <w:r>
+        <w:rPr>
+          <w:rFonts w:ascii="Google Sans Text" w:hAnsi="Google Sans Text" w:cs="Google Sans Text" w:eastAsia="Google Sans Text"/>
+          <w:rtl w:val="0"/>
+          <w:lang w:val="ru-BY" w:bidi="ru-BY" w:eastAsia="ru-BY"/>
+        </w:rPr>
+        <w:t>обязательно (открывается под тур)</w:t>
       </w:r>
     </w:p>
     <w:p>
@@ -630,13 +666,7 @@
         <w:rPr>
           <w:b w:val="1"/>
         </w:rPr>
-        <w:t xml:space="preserve"> </w:t>
-      </w:r>
-      <w:r>
-        <w:rPr>
-          <w:b w:val="1"/>
-        </w:rPr>
-        <w:t>https://docs.google.com/document/d/19ehBDjx5uBRQ1l29z2eo2RrIPEJ1GcLu</w:t>
+        <w:t xml:space="preserve"> https://docs.google.com/document/d/19ehBDjx5uBRQ1l29z2eo2RrIPEJ1GcLu</w:t>
       </w:r>
     </w:p>
     <w:sectPr>
@@ -9061,7 +9091,7 @@
           <w:insideH w:val="nil"/>
           <w:insideV w:val="nil"/>
         </w:tcBorders>
-        <w:shd w:val="clear" w:color="auto" w:fill="CCCCCC" w:themeFill="text1" w:themeFillTint="32"/>
+        <w:shd w:val="clear" w:color="auto" w:fill="CDCDCD" w:themeFill="text1" w:themeFillTint="31"/>
       </w:tcPr>
     </w:tblStylePr>
     <w:tblStylePr w:type="firstCol">
@@ -9113,7 +9143,7 @@
       <w:tblPr/>
       <w:trPr/>
       <w:tcPr>
-        <w:shd w:val="clear" w:color="auto" w:fill="E6E6E6" w:themeFill="text1" w:themeFillTint="18"/>
+        <w:shd w:val="clear" w:color="auto" w:fill="E7E7E7" w:themeFill="text1" w:themeFillTint="18"/>
       </w:tcPr>
     </w:tblStylePr>
   </w:style>
@@ -9192,7 +9222,7 @@
           <w:insideH w:val="nil"/>
           <w:insideV w:val="nil"/>
         </w:tcBorders>
-        <w:shd w:val="clear" w:color="auto" w:fill="DCE6F2" w:themeFill="accent1" w:themeFillTint="32"/>
+        <w:shd w:val="clear" w:color="auto" w:fill="DCE6F2" w:themeFill="accent1" w:themeFillTint="31"/>
       </w:tcPr>
     </w:tblStylePr>
     <w:tblStylePr w:type="firstCol">
@@ -9323,7 +9353,7 @@
           <w:insideH w:val="nil"/>
           <w:insideV w:val="nil"/>
         </w:tcBorders>
-        <w:shd w:val="clear" w:color="auto" w:fill="F2DCDB" w:themeFill="accent2" w:themeFillTint="32"/>
+        <w:shd w:val="clear" w:color="auto" w:fill="F3DDDC" w:themeFill="accent2" w:themeFillTint="31"/>
       </w:tcPr>
     </w:tblStylePr>
     <w:tblStylePr w:type="firstCol">
@@ -9375,7 +9405,7 @@
       <w:tblPr/>
       <w:trPr/>
       <w:tcPr>
-        <w:shd w:val="clear" w:color="auto" w:fill="F9EEEE" w:themeFill="accent2" w:themeFillTint="18"/>
+        <w:shd w:val="clear" w:color="auto" w:fill="F9EFEE" w:themeFill="accent2" w:themeFillTint="18"/>
       </w:tcPr>
     </w:tblStylePr>
   </w:style>
@@ -9454,7 +9484,7 @@
           <w:insideH w:val="nil"/>
           <w:insideV w:val="nil"/>
         </w:tcBorders>
-        <w:shd w:val="clear" w:color="auto" w:fill="EBF1DE" w:themeFill="accent3" w:themeFillTint="32"/>
+        <w:shd w:val="clear" w:color="auto" w:fill="EBF2DE" w:themeFill="accent3" w:themeFillTint="31"/>
       </w:tcPr>
     </w:tblStylePr>
     <w:tblStylePr w:type="firstCol">
@@ -9506,7 +9536,7 @@
       <w:tblPr/>
       <w:trPr/>
       <w:tcPr>
-        <w:shd w:val="clear" w:color="auto" w:fill="F5F8EF" w:themeFill="accent3" w:themeFillTint="18"/>
+        <w:shd w:val="clear" w:color="auto" w:fill="F6F9EF" w:themeFill="accent3" w:themeFillTint="18"/>
       </w:tcPr>
     </w:tblStylePr>
   </w:style>
@@ -9585,7 +9615,7 @@
           <w:insideH w:val="nil"/>
           <w:insideV w:val="nil"/>
         </w:tcBorders>
-        <w:shd w:val="clear" w:color="auto" w:fill="E6E0EC" w:themeFill="accent4" w:themeFillTint="32"/>
+        <w:shd w:val="clear" w:color="auto" w:fill="E6E1ED" w:themeFill="accent4" w:themeFillTint="31"/>
       </w:tcPr>
     </w:tblStylePr>
     <w:tblStylePr w:type="firstCol">
@@ -9716,7 +9746,7 @@
           <w:insideH w:val="nil"/>
           <w:insideV w:val="nil"/>
         </w:tcBorders>
-        <w:shd w:val="clear" w:color="auto" w:fill="DBEEF4" w:themeFill="accent5" w:themeFillTint="32"/>
+        <w:shd w:val="clear" w:color="auto" w:fill="DCEFF4" w:themeFill="accent5" w:themeFillTint="31"/>
       </w:tcPr>
     </w:tblStylePr>
     <w:tblStylePr w:type="firstCol">
@@ -9768,7 +9798,7 @@
       <w:tblPr/>
       <w:trPr/>
       <w:tcPr>
-        <w:shd w:val="clear" w:color="auto" w:fill="EDF7F9" w:themeFill="accent5" w:themeFillTint="18"/>
+        <w:shd w:val="clear" w:color="auto" w:fill="EEF7FA" w:themeFill="accent5" w:themeFillTint="18"/>
       </w:tcPr>
     </w:tblStylePr>
   </w:style>
@@ -9847,7 +9877,7 @@
           <w:insideH w:val="nil"/>
           <w:insideV w:val="nil"/>
         </w:tcBorders>
-        <w:shd w:val="clear" w:color="auto" w:fill="FDEADA" w:themeFill="accent6" w:themeFillTint="32"/>
+        <w:shd w:val="clear" w:color="auto" w:fill="FDEADB" w:themeFill="accent6" w:themeFillTint="31"/>
       </w:tcPr>
     </w:tblStylePr>
     <w:tblStylePr w:type="firstCol">
@@ -9899,7 +9929,7 @@
       <w:tblPr/>
       <w:trPr/>
       <w:tcPr>
-        <w:shd w:val="clear" w:color="auto" w:fill="FEF5ED" w:themeFill="accent6" w:themeFillTint="18"/>
+        <w:shd w:val="clear" w:color="auto" w:fill="FEF5EE" w:themeFill="accent6" w:themeFillTint="18"/>
       </w:tcPr>
     </w:tblStylePr>
   </w:style>
@@ -11788,7 +11818,7 @@
     </w:tblPr>
     <w:trPr/>
     <w:tcPr>
-      <w:shd w:val="clear" w:color="auto" w:fill="E6E6E6" w:themeFill="text1" w:themeFillTint="18"/>
+      <w:shd w:val="clear" w:color="auto" w:fill="E7E7E7" w:themeFill="text1" w:themeFillTint="18"/>
     </w:tcPr>
     <w:tblStylePr w:type="nwCell">
       <w:rPr>
@@ -12054,7 +12084,7 @@
     </w:tblPr>
     <w:trPr/>
     <w:tcPr>
-      <w:shd w:val="clear" w:color="auto" w:fill="F9EEEE" w:themeFill="accent2" w:themeFillTint="18"/>
+      <w:shd w:val="clear" w:color="auto" w:fill="F9EFEE" w:themeFill="accent2" w:themeFillTint="18"/>
     </w:tcPr>
     <w:tblStylePr w:type="nwCell">
       <w:rPr>
@@ -12187,7 +12217,7 @@
     </w:tblPr>
     <w:trPr/>
     <w:tcPr>
-      <w:shd w:val="clear" w:color="auto" w:fill="F5F8EF" w:themeFill="accent3" w:themeFillTint="18"/>
+      <w:shd w:val="clear" w:color="auto" w:fill="F6F9EF" w:themeFill="accent3" w:themeFillTint="18"/>
     </w:tcPr>
     <w:tblStylePr w:type="band1Horz">
       <w:tblPr/>
@@ -12437,7 +12467,7 @@
     </w:tblPr>
     <w:trPr/>
     <w:tcPr>
-      <w:shd w:val="clear" w:color="auto" w:fill="EDF7F9" w:themeFill="accent5" w:themeFillTint="18"/>
+      <w:shd w:val="clear" w:color="auto" w:fill="EEF7FA" w:themeFill="accent5" w:themeFillTint="18"/>
     </w:tcPr>
     <w:tblStylePr w:type="nwCell">
       <w:rPr>
@@ -12570,7 +12600,7 @@
     </w:tblPr>
     <w:trPr/>
     <w:tcPr>
-      <w:shd w:val="clear" w:color="auto" w:fill="FEF5ED" w:themeFill="accent6" w:themeFillTint="18"/>
+      <w:shd w:val="clear" w:color="auto" w:fill="FEF5EE" w:themeFill="accent6" w:themeFillTint="18"/>
     </w:tcPr>
     <w:tblStylePr w:type="nwCell">
       <w:rPr>
@@ -12695,13 +12725,13 @@
     </w:tblPr>
     <w:trPr/>
     <w:tcPr>
-      <w:shd w:val="clear" w:color="auto" w:fill="E6E6E6" w:themeFill="text1" w:themeFillTint="18"/>
+      <w:shd w:val="clear" w:color="auto" w:fill="E7E7E7" w:themeFill="text1" w:themeFillTint="18"/>
     </w:tcPr>
     <w:tblStylePr w:type="band1Horz">
       <w:tblPr/>
       <w:trPr/>
       <w:tcPr>
-        <w:shd w:val="clear" w:color="auto" w:fill="CCCCCC" w:themeFill="text1" w:themeFillTint="32"/>
+        <w:shd w:val="clear" w:color="auto" w:fill="CDCDCD" w:themeFill="text1" w:themeFillTint="31"/>
       </w:tcPr>
     </w:tblStylePr>
     <w:tblStylePr w:type="band1Vert">
@@ -12796,7 +12826,7 @@
       <w:tblPr/>
       <w:trPr/>
       <w:tcPr>
-        <w:shd w:val="clear" w:color="auto" w:fill="DCE6F2" w:themeFill="accent1" w:themeFillTint="32"/>
+        <w:shd w:val="clear" w:color="auto" w:fill="DCE6F2" w:themeFill="accent1" w:themeFillTint="31"/>
       </w:tcPr>
     </w:tblStylePr>
     <w:tblStylePr w:type="band1Vert">
@@ -12885,13 +12915,13 @@
     </w:tblPr>
     <w:trPr/>
     <w:tcPr>
-      <w:shd w:val="clear" w:color="auto" w:fill="F9EEEE" w:themeFill="accent2" w:themeFillTint="18"/>
+      <w:shd w:val="clear" w:color="auto" w:fill="F9EFEE" w:themeFill="accent2" w:themeFillTint="18"/>
     </w:tcPr>
     <w:tblStylePr w:type="band1Horz">
       <w:tblPr/>
       <w:trPr/>
       <w:tcPr>
-        <w:shd w:val="clear" w:color="auto" w:fill="F2DCDB" w:themeFill="accent2" w:themeFillTint="32"/>
+        <w:shd w:val="clear" w:color="auto" w:fill="F3DDDC" w:themeFill="accent2" w:themeFillTint="31"/>
       </w:tcPr>
     </w:tblStylePr>
     <w:tblStylePr w:type="band1Vert">
@@ -12980,13 +13010,13 @@
     </w:tblPr>
     <w:trPr/>
     <w:tcPr>
-      <w:shd w:val="clear" w:color="auto" w:fill="F5F8EF" w:themeFill="accent3" w:themeFillTint="18"/>
+      <w:shd w:val="clear" w:color="auto" w:fill="F6F9EF" w:themeFill="accent3" w:themeFillTint="18"/>
     </w:tcPr>
     <w:tblStylePr w:type="band1Horz">
       <w:tblPr/>
       <w:trPr/>
       <w:tcPr>
-        <w:shd w:val="clear" w:color="auto" w:fill="EBF1DE" w:themeFill="accent3" w:themeFillTint="32"/>
+        <w:shd w:val="clear" w:color="auto" w:fill="EBF2DE" w:themeFill="accent3" w:themeFillTint="31"/>
       </w:tcPr>
     </w:tblStylePr>
     <w:tblStylePr w:type="band1Vert">
@@ -13081,7 +13111,7 @@
       <w:tblPr/>
       <w:trPr/>
       <w:tcPr>
-        <w:shd w:val="clear" w:color="auto" w:fill="E6E0EC" w:themeFill="accent4" w:themeFillTint="32"/>
+        <w:shd w:val="clear" w:color="auto" w:fill="E6E1ED" w:themeFill="accent4" w:themeFillTint="31"/>
       </w:tcPr>
     </w:tblStylePr>
     <w:tblStylePr w:type="band1Vert">
@@ -13170,13 +13200,13 @@
     </w:tblPr>
     <w:trPr/>
     <w:tcPr>
-      <w:shd w:val="clear" w:color="auto" w:fill="EDF7F9" w:themeFill="accent5" w:themeFillTint="18"/>
+      <w:shd w:val="clear" w:color="auto" w:fill="EEF7FA" w:themeFill="accent5" w:themeFillTint="18"/>
     </w:tcPr>
     <w:tblStylePr w:type="band1Horz">
       <w:tblPr/>
       <w:trPr/>
       <w:tcPr>
-        <w:shd w:val="clear" w:color="auto" w:fill="DBEEF4" w:themeFill="accent5" w:themeFillTint="32"/>
+        <w:shd w:val="clear" w:color="auto" w:fill="DCEFF4" w:themeFill="accent5" w:themeFillTint="31"/>
       </w:tcPr>
     </w:tblStylePr>
     <w:tblStylePr w:type="band1Vert">
@@ -13265,13 +13295,13 @@
     </w:tblPr>
     <w:trPr/>
     <w:tcPr>
-      <w:shd w:val="clear" w:color="auto" w:fill="FEF5ED" w:themeFill="accent6" w:themeFillTint="18"/>
+      <w:shd w:val="clear" w:color="auto" w:fill="FEF5EE" w:themeFill="accent6" w:themeFillTint="18"/>
     </w:tcPr>
     <w:tblStylePr w:type="band1Horz">
       <w:tblPr/>
       <w:trPr/>
       <w:tcPr>
-        <w:shd w:val="clear" w:color="auto" w:fill="FDEADA" w:themeFill="accent6" w:themeFillTint="32"/>
+        <w:shd w:val="clear" w:color="auto" w:fill="FDEADB" w:themeFill="accent6" w:themeFillTint="31"/>
       </w:tcPr>
     </w:tblStylePr>
     <w:tblStylePr w:type="band1Vert">
@@ -13363,7 +13393,7 @@
     </w:tblPr>
     <w:trPr/>
     <w:tcPr>
-      <w:shd w:val="clear" w:color="auto" w:fill="CCCCCC" w:themeFill="text1" w:themeFillTint="32"/>
+      <w:shd w:val="clear" w:color="auto" w:fill="CDCDCD" w:themeFill="text1" w:themeFillTint="31"/>
     </w:tcPr>
     <w:tblStylePr w:type="band1Horz">
       <w:tblPr/>
@@ -13448,7 +13478,7 @@
     </w:tblPr>
     <w:trPr/>
     <w:tcPr>
-      <w:shd w:val="clear" w:color="auto" w:fill="DCE6F2" w:themeFill="accent1" w:themeFillTint="32"/>
+      <w:shd w:val="clear" w:color="auto" w:fill="DCE6F2" w:themeFill="accent1" w:themeFillTint="31"/>
     </w:tcPr>
     <w:tblStylePr w:type="band1Horz">
       <w:tblPr/>
@@ -13533,7 +13563,7 @@
     </w:tblPr>
     <w:trPr/>
     <w:tcPr>
-      <w:shd w:val="clear" w:color="auto" w:fill="F2DCDB" w:themeFill="accent2" w:themeFillTint="32"/>
+      <w:shd w:val="clear" w:color="auto" w:fill="F3DDDC" w:themeFill="accent2" w:themeFillTint="31"/>
     </w:tcPr>
     <w:tblStylePr w:type="band1Horz">
       <w:tblPr/>
@@ -13618,7 +13648,7 @@
     </w:tblPr>
     <w:trPr/>
     <w:tcPr>
-      <w:shd w:val="clear" w:color="auto" w:fill="EBF1DE" w:themeFill="accent3" w:themeFillTint="32"/>
+      <w:shd w:val="clear" w:color="auto" w:fill="EBF2DE" w:themeFill="accent3" w:themeFillTint="31"/>
     </w:tcPr>
     <w:tblStylePr w:type="band1Horz">
       <w:tblPr/>
@@ -13703,7 +13733,7 @@
     </w:tblPr>
     <w:trPr/>
     <w:tcPr>
-      <w:shd w:val="clear" w:color="auto" w:fill="E6E0EC" w:themeFill="accent4" w:themeFillTint="32"/>
+      <w:shd w:val="clear" w:color="auto" w:fill="E6E1ED" w:themeFill="accent4" w:themeFillTint="31"/>
     </w:tcPr>
     <w:tblStylePr w:type="band1Horz">
       <w:tblPr/>
@@ -13788,7 +13818,7 @@
     </w:tblPr>
     <w:trPr/>
     <w:tcPr>
-      <w:shd w:val="clear" w:color="auto" w:fill="DBEEF4" w:themeFill="accent5" w:themeFillTint="32"/>
+      <w:shd w:val="clear" w:color="auto" w:fill="DCEFF4" w:themeFill="accent5" w:themeFillTint="31"/>
     </w:tcPr>
     <w:tblStylePr w:type="band1Horz">
       <w:tblPr/>
@@ -13873,7 +13903,7 @@
     </w:tblPr>
     <w:trPr/>
     <w:tcPr>
-      <w:shd w:val="clear" w:color="auto" w:fill="FDEADA" w:themeFill="accent6" w:themeFillTint="32"/>
+      <w:shd w:val="clear" w:color="auto" w:fill="FDEADB" w:themeFill="accent6" w:themeFillTint="31"/>
     </w:tcPr>
     <w:tblStylePr w:type="band1Horz">
       <w:tblPr/>

</xml_diff>